<commit_message>
docs: update DigComp3.0 translations and output files
</commit_message>
<xml_diff>
--- a/output/DigComp3_acronyms_en.docx
+++ b/output/DigComp3_acronyms_en.docx
@@ -8,6 +8,9 @@
       </w:pPr>
       <w:r>
         <w:rPr>
+          <w:rFonts w:ascii="Arial" w:hAnsi="Arial"/>
+          <w:b w:val="0"/>
+          <w:i w:val="0"/>
           <w:color w:val="1F4E78"/>
           <w:sz w:val="36"/>
         </w:rPr>
@@ -17,28 +20,27 @@
     <w:tbl>
       <w:tblPr>
         <w:tblW w:type="auto" w:w="0"/>
-        <w:tblLayout w:type="fixed"/>
         <w:tblLook w:firstColumn="1" w:firstRow="1" w:lastColumn="0" w:lastRow="0" w:noHBand="0" w:noVBand="1" w:val="04A0"/>
+        <w:tblW w:w="5000" w:type="pct"/>
         <w:tblBorders>
           <w:left w:val="nil"/>
           <w:right w:val="nil"/>
           <w:insideV w:val="nil"/>
-          <w:top w:val="single" w:sz="4" w:space="0" w:color="D9D9D9"/>
-          <w:bottom w:val="single" w:sz="4" w:space="0" w:color="D9D9D9"/>
-          <w:insideH w:val="single" w:sz="4" w:space="0" w:color="D9D9D9"/>
+          <w:top w:val="single" w:sz="2" w:color="D9D9D9"/>
+          <w:bottom w:val="single" w:sz="2" w:color="D9D9D9"/>
+          <w:insideH w:val="single" w:sz="2" w:color="D9D9D9"/>
         </w:tblBorders>
       </w:tblPr>
       <w:tblGrid>
-        <w:gridCol w:w="1247"/>
-        <w:gridCol w:w="3685"/>
-        <w:gridCol w:w="1247"/>
-        <w:gridCol w:w="3685"/>
+        <w:gridCol w:w="2160"/>
+        <w:gridCol w:w="2160"/>
+        <w:gridCol w:w="2160"/>
+        <w:gridCol w:w="2160"/>
       </w:tblGrid>
       <w:tr>
         <w:tc>
           <w:tcPr>
-            <w:tcW w:type="dxa" w:w="1247"/>
-            <w:vAlign w:val="top"/>
+            <w:tcW w:type="dxa" w:w="2160"/>
             <w:shd w:fill="1F4E78"/>
           </w:tcPr>
           <w:p>
@@ -46,8 +48,9 @@
               <w:rPr>
                 <w:rFonts w:ascii="Arial" w:hAnsi="Arial"/>
                 <w:b/>
+                <w:i w:val="0"/>
                 <w:color w:val="FFFFFF"/>
-                <w:sz w:val="20"/>
+                <w:sz w:val="22"/>
               </w:rPr>
               <w:t>ACRONYM</w:t>
             </w:r>
@@ -55,8 +58,7 @@
         </w:tc>
         <w:tc>
           <w:tcPr>
-            <w:tcW w:type="dxa" w:w="3685"/>
-            <w:vAlign w:val="top"/>
+            <w:tcW w:type="dxa" w:w="2160"/>
             <w:shd w:fill="1F4E78"/>
           </w:tcPr>
           <w:p>
@@ -64,8 +66,9 @@
               <w:rPr>
                 <w:rFonts w:ascii="Arial" w:hAnsi="Arial"/>
                 <w:b/>
+                <w:i w:val="0"/>
                 <w:color w:val="FFFFFF"/>
-                <w:sz w:val="20"/>
+                <w:sz w:val="22"/>
               </w:rPr>
               <w:t>DESCRIPTION</w:t>
             </w:r>
@@ -73,8 +76,7 @@
         </w:tc>
         <w:tc>
           <w:tcPr>
-            <w:tcW w:type="dxa" w:w="1247"/>
-            <w:vAlign w:val="top"/>
+            <w:tcW w:type="dxa" w:w="2160"/>
             <w:shd w:fill="1F4E78"/>
           </w:tcPr>
           <w:p>
@@ -82,8 +84,9 @@
               <w:rPr>
                 <w:rFonts w:ascii="Arial" w:hAnsi="Arial"/>
                 <w:b/>
+                <w:i w:val="0"/>
                 <w:color w:val="FFFFFF"/>
-                <w:sz w:val="20"/>
+                <w:sz w:val="22"/>
               </w:rPr>
               <w:t>ACRONYM</w:t>
             </w:r>
@@ -91,8 +94,7 @@
         </w:tc>
         <w:tc>
           <w:tcPr>
-            <w:tcW w:type="dxa" w:w="3685"/>
-            <w:vAlign w:val="top"/>
+            <w:tcW w:type="dxa" w:w="2160"/>
             <w:shd w:fill="1F4E78"/>
           </w:tcPr>
           <w:p>
@@ -100,8 +102,9 @@
               <w:rPr>
                 <w:rFonts w:ascii="Arial" w:hAnsi="Arial"/>
                 <w:b/>
+                <w:i w:val="0"/>
                 <w:color w:val="FFFFFF"/>
-                <w:sz w:val="20"/>
+                <w:sz w:val="22"/>
               </w:rPr>
               <w:t>DESCRIPTION</w:t>
             </w:r>
@@ -111,16 +114,16 @@
       <w:tr>
         <w:tc>
           <w:tcPr>
-            <w:tcW w:type="dxa" w:w="1247"/>
-            <w:vAlign w:val="top"/>
+            <w:tcW w:type="dxa" w:w="2160"/>
           </w:tcPr>
           <w:p>
             <w:r>
               <w:rPr>
                 <w:rFonts w:ascii="Arial" w:hAnsi="Arial"/>
                 <w:b/>
+                <w:i w:val="0"/>
                 <w:color w:val="000000"/>
-                <w:sz w:val="18"/>
+                <w:sz w:val="22"/>
               </w:rPr>
               <w:t>AGRI</w:t>
             </w:r>
@@ -128,16 +131,16 @@
         </w:tc>
         <w:tc>
           <w:tcPr>
-            <w:tcW w:type="dxa" w:w="3685"/>
-            <w:vAlign w:val="top"/>
+            <w:tcW w:type="dxa" w:w="2160"/>
           </w:tcPr>
           <w:p>
             <w:r>
               <w:rPr>
                 <w:rFonts w:ascii="Arial" w:hAnsi="Arial"/>
                 <w:b w:val="0"/>
+                <w:i w:val="0"/>
                 <w:color w:val="000000"/>
-                <w:sz w:val="18"/>
+                <w:sz w:val="22"/>
               </w:rPr>
               <w:t>Directorate-General for Agriculture and Rural Development</w:t>
             </w:r>
@@ -145,16 +148,16 @@
         </w:tc>
         <w:tc>
           <w:tcPr>
-            <w:tcW w:type="dxa" w:w="1247"/>
-            <w:vAlign w:val="top"/>
+            <w:tcW w:type="dxa" w:w="2160"/>
           </w:tcPr>
           <w:p>
             <w:r>
               <w:rPr>
                 <w:rFonts w:ascii="Arial" w:hAnsi="Arial"/>
                 <w:b/>
+                <w:i w:val="0"/>
                 <w:color w:val="000000"/>
-                <w:sz w:val="18"/>
+                <w:sz w:val="22"/>
               </w:rPr>
               <w:t>ITU</w:t>
             </w:r>
@@ -162,16 +165,16 @@
         </w:tc>
         <w:tc>
           <w:tcPr>
-            <w:tcW w:type="dxa" w:w="3685"/>
-            <w:vAlign w:val="top"/>
+            <w:tcW w:type="dxa" w:w="2160"/>
           </w:tcPr>
           <w:p>
             <w:r>
               <w:rPr>
                 <w:rFonts w:ascii="Arial" w:hAnsi="Arial"/>
                 <w:b w:val="0"/>
+                <w:i w:val="0"/>
                 <w:color w:val="000000"/>
-                <w:sz w:val="18"/>
+                <w:sz w:val="22"/>
               </w:rPr>
               <w:t>International Telecommunications Union</w:t>
             </w:r>
@@ -181,16 +184,16 @@
       <w:tr>
         <w:tc>
           <w:tcPr>
-            <w:tcW w:type="dxa" w:w="1247"/>
-            <w:vAlign w:val="top"/>
+            <w:tcW w:type="dxa" w:w="2160"/>
           </w:tcPr>
           <w:p>
             <w:r>
               <w:rPr>
                 <w:rFonts w:ascii="Arial" w:hAnsi="Arial"/>
                 <w:b/>
+                <w:i w:val="0"/>
                 <w:color w:val="000000"/>
-                <w:sz w:val="18"/>
+                <w:sz w:val="22"/>
               </w:rPr>
               <w:t>AI</w:t>
             </w:r>
@@ -198,16 +201,16 @@
         </w:tc>
         <w:tc>
           <w:tcPr>
-            <w:tcW w:type="dxa" w:w="3685"/>
-            <w:vAlign w:val="top"/>
+            <w:tcW w:type="dxa" w:w="2160"/>
           </w:tcPr>
           <w:p>
             <w:r>
               <w:rPr>
                 <w:rFonts w:ascii="Arial" w:hAnsi="Arial"/>
                 <w:b w:val="0"/>
+                <w:i w:val="0"/>
                 <w:color w:val="000000"/>
-                <w:sz w:val="18"/>
+                <w:sz w:val="22"/>
               </w:rPr>
               <w:t>Artificial Intelligence</w:t>
             </w:r>
@@ -215,16 +218,16 @@
         </w:tc>
         <w:tc>
           <w:tcPr>
-            <w:tcW w:type="dxa" w:w="1247"/>
-            <w:vAlign w:val="top"/>
+            <w:tcW w:type="dxa" w:w="2160"/>
           </w:tcPr>
           <w:p>
             <w:r>
               <w:rPr>
                 <w:rFonts w:ascii="Arial" w:hAnsi="Arial"/>
                 <w:b/>
+                <w:i w:val="0"/>
                 <w:color w:val="000000"/>
-                <w:sz w:val="18"/>
+                <w:sz w:val="22"/>
               </w:rPr>
               <w:t>JRC</w:t>
             </w:r>
@@ -232,16 +235,16 @@
         </w:tc>
         <w:tc>
           <w:tcPr>
-            <w:tcW w:type="dxa" w:w="3685"/>
-            <w:vAlign w:val="top"/>
+            <w:tcW w:type="dxa" w:w="2160"/>
           </w:tcPr>
           <w:p>
             <w:r>
               <w:rPr>
                 <w:rFonts w:ascii="Arial" w:hAnsi="Arial"/>
                 <w:b w:val="0"/>
+                <w:i w:val="0"/>
                 <w:color w:val="000000"/>
-                <w:sz w:val="18"/>
+                <w:sz w:val="22"/>
               </w:rPr>
               <w:t>Joint Research Centre</w:t>
             </w:r>
@@ -251,16 +254,16 @@
       <w:tr>
         <w:tc>
           <w:tcPr>
-            <w:tcW w:type="dxa" w:w="1247"/>
-            <w:vAlign w:val="top"/>
+            <w:tcW w:type="dxa" w:w="2160"/>
           </w:tcPr>
           <w:p>
             <w:r>
               <w:rPr>
                 <w:rFonts w:ascii="Arial" w:hAnsi="Arial"/>
                 <w:b/>
+                <w:i w:val="0"/>
                 <w:color w:val="000000"/>
-                <w:sz w:val="18"/>
+                <w:sz w:val="22"/>
               </w:rPr>
               <w:t>AR</w:t>
             </w:r>
@@ -268,16 +271,16 @@
         </w:tc>
         <w:tc>
           <w:tcPr>
-            <w:tcW w:type="dxa" w:w="3685"/>
-            <w:vAlign w:val="top"/>
+            <w:tcW w:type="dxa" w:w="2160"/>
           </w:tcPr>
           <w:p>
             <w:r>
               <w:rPr>
                 <w:rFonts w:ascii="Arial" w:hAnsi="Arial"/>
                 <w:b w:val="0"/>
+                <w:i w:val="0"/>
                 <w:color w:val="000000"/>
-                <w:sz w:val="18"/>
+                <w:sz w:val="22"/>
               </w:rPr>
               <w:t>Augmented Reality</w:t>
             </w:r>
@@ -285,16 +288,16 @@
         </w:tc>
         <w:tc>
           <w:tcPr>
-            <w:tcW w:type="dxa" w:w="1247"/>
-            <w:vAlign w:val="top"/>
+            <w:tcW w:type="dxa" w:w="2160"/>
           </w:tcPr>
           <w:p>
             <w:r>
               <w:rPr>
                 <w:rFonts w:ascii="Arial" w:hAnsi="Arial"/>
                 <w:b/>
+                <w:i w:val="0"/>
                 <w:color w:val="000000"/>
-                <w:sz w:val="18"/>
+                <w:sz w:val="22"/>
               </w:rPr>
               <w:t>JSON</w:t>
             </w:r>
@@ -302,16 +305,16 @@
         </w:tc>
         <w:tc>
           <w:tcPr>
-            <w:tcW w:type="dxa" w:w="3685"/>
-            <w:vAlign w:val="top"/>
+            <w:tcW w:type="dxa" w:w="2160"/>
           </w:tcPr>
           <w:p>
             <w:r>
               <w:rPr>
                 <w:rFonts w:ascii="Arial" w:hAnsi="Arial"/>
                 <w:b w:val="0"/>
+                <w:i w:val="0"/>
                 <w:color w:val="000000"/>
-                <w:sz w:val="18"/>
+                <w:sz w:val="22"/>
               </w:rPr>
               <w:t>JavaScript Object Notation</w:t>
             </w:r>
@@ -321,16 +324,16 @@
       <w:tr>
         <w:tc>
           <w:tcPr>
-            <w:tcW w:type="dxa" w:w="1247"/>
-            <w:vAlign w:val="top"/>
+            <w:tcW w:type="dxa" w:w="2160"/>
           </w:tcPr>
           <w:p>
             <w:r>
               <w:rPr>
                 <w:rFonts w:ascii="Arial" w:hAnsi="Arial"/>
                 <w:b/>
+                <w:i w:val="0"/>
                 <w:color w:val="000000"/>
-                <w:sz w:val="18"/>
+                <w:sz w:val="22"/>
               </w:rPr>
               <w:t>CNECT</w:t>
             </w:r>
@@ -338,16 +341,16 @@
         </w:tc>
         <w:tc>
           <w:tcPr>
-            <w:tcW w:type="dxa" w:w="3685"/>
-            <w:vAlign w:val="top"/>
+            <w:tcW w:type="dxa" w:w="2160"/>
           </w:tcPr>
           <w:p>
             <w:r>
               <w:rPr>
                 <w:rFonts w:ascii="Arial" w:hAnsi="Arial"/>
                 <w:b w:val="0"/>
+                <w:i w:val="0"/>
                 <w:color w:val="000000"/>
-                <w:sz w:val="18"/>
+                <w:sz w:val="22"/>
               </w:rPr>
               <w:t>Directorate-General for Communications Networks, Content and Technology</w:t>
             </w:r>
@@ -355,16 +358,16 @@
         </w:tc>
         <w:tc>
           <w:tcPr>
-            <w:tcW w:type="dxa" w:w="1247"/>
-            <w:vAlign w:val="top"/>
+            <w:tcW w:type="dxa" w:w="2160"/>
           </w:tcPr>
           <w:p>
             <w:r>
               <w:rPr>
                 <w:rFonts w:ascii="Arial" w:hAnsi="Arial"/>
                 <w:b/>
+                <w:i w:val="0"/>
                 <w:color w:val="000000"/>
-                <w:sz w:val="18"/>
+                <w:sz w:val="22"/>
               </w:rPr>
               <w:t>MR</w:t>
             </w:r>
@@ -372,16 +375,16 @@
         </w:tc>
         <w:tc>
           <w:tcPr>
-            <w:tcW w:type="dxa" w:w="3685"/>
-            <w:vAlign w:val="top"/>
+            <w:tcW w:type="dxa" w:w="2160"/>
           </w:tcPr>
           <w:p>
             <w:r>
               <w:rPr>
                 <w:rFonts w:ascii="Arial" w:hAnsi="Arial"/>
                 <w:b w:val="0"/>
+                <w:i w:val="0"/>
                 <w:color w:val="000000"/>
-                <w:sz w:val="18"/>
+                <w:sz w:val="22"/>
               </w:rPr>
               <w:t>Mixed Reality</w:t>
             </w:r>
@@ -391,16 +394,16 @@
       <w:tr>
         <w:tc>
           <w:tcPr>
-            <w:tcW w:type="dxa" w:w="1247"/>
-            <w:vAlign w:val="top"/>
+            <w:tcW w:type="dxa" w:w="2160"/>
           </w:tcPr>
           <w:p>
             <w:r>
               <w:rPr>
                 <w:rFonts w:ascii="Arial" w:hAnsi="Arial"/>
                 <w:b/>
+                <w:i w:val="0"/>
                 <w:color w:val="000000"/>
-                <w:sz w:val="18"/>
+                <w:sz w:val="22"/>
               </w:rPr>
               <w:t>DIGIT</w:t>
             </w:r>
@@ -408,16 +411,16 @@
         </w:tc>
         <w:tc>
           <w:tcPr>
-            <w:tcW w:type="dxa" w:w="3685"/>
-            <w:vAlign w:val="top"/>
+            <w:tcW w:type="dxa" w:w="2160"/>
           </w:tcPr>
           <w:p>
             <w:r>
               <w:rPr>
                 <w:rFonts w:ascii="Arial" w:hAnsi="Arial"/>
                 <w:b w:val="0"/>
+                <w:i w:val="0"/>
                 <w:color w:val="000000"/>
-                <w:sz w:val="18"/>
+                <w:sz w:val="22"/>
               </w:rPr>
               <w:t>Directorate-General for Digital Services</w:t>
             </w:r>
@@ -425,16 +428,16 @@
         </w:tc>
         <w:tc>
           <w:tcPr>
-            <w:tcW w:type="dxa" w:w="1247"/>
-            <w:vAlign w:val="top"/>
+            <w:tcW w:type="dxa" w:w="2160"/>
           </w:tcPr>
           <w:p>
             <w:r>
               <w:rPr>
                 <w:rFonts w:ascii="Arial" w:hAnsi="Arial"/>
                 <w:b/>
+                <w:i w:val="0"/>
                 <w:color w:val="000000"/>
-                <w:sz w:val="18"/>
+                <w:sz w:val="22"/>
               </w:rPr>
               <w:t>NQF</w:t>
             </w:r>
@@ -442,16 +445,16 @@
         </w:tc>
         <w:tc>
           <w:tcPr>
-            <w:tcW w:type="dxa" w:w="3685"/>
-            <w:vAlign w:val="top"/>
+            <w:tcW w:type="dxa" w:w="2160"/>
           </w:tcPr>
           <w:p>
             <w:r>
               <w:rPr>
                 <w:rFonts w:ascii="Arial" w:hAnsi="Arial"/>
                 <w:b w:val="0"/>
+                <w:i w:val="0"/>
                 <w:color w:val="000000"/>
-                <w:sz w:val="18"/>
+                <w:sz w:val="22"/>
               </w:rPr>
               <w:t>National Qualifications Framework</w:t>
             </w:r>
@@ -461,16 +464,16 @@
       <w:tr>
         <w:tc>
           <w:tcPr>
-            <w:tcW w:type="dxa" w:w="1247"/>
-            <w:vAlign w:val="top"/>
+            <w:tcW w:type="dxa" w:w="2160"/>
           </w:tcPr>
           <w:p>
             <w:r>
               <w:rPr>
                 <w:rFonts w:ascii="Arial" w:hAnsi="Arial"/>
                 <w:b/>
+                <w:i w:val="0"/>
                 <w:color w:val="000000"/>
-                <w:sz w:val="18"/>
+                <w:sz w:val="22"/>
               </w:rPr>
               <w:t>EAC</w:t>
             </w:r>
@@ -478,16 +481,16 @@
         </w:tc>
         <w:tc>
           <w:tcPr>
-            <w:tcW w:type="dxa" w:w="3685"/>
-            <w:vAlign w:val="top"/>
+            <w:tcW w:type="dxa" w:w="2160"/>
           </w:tcPr>
           <w:p>
             <w:r>
               <w:rPr>
                 <w:rFonts w:ascii="Arial" w:hAnsi="Arial"/>
                 <w:b w:val="0"/>
+                <w:i w:val="0"/>
                 <w:color w:val="000000"/>
-                <w:sz w:val="18"/>
+                <w:sz w:val="22"/>
               </w:rPr>
               <w:t>Directorate-General for Education, Youth, Sport and Culture</w:t>
             </w:r>
@@ -495,16 +498,16 @@
         </w:tc>
         <w:tc>
           <w:tcPr>
-            <w:tcW w:type="dxa" w:w="1247"/>
-            <w:vAlign w:val="top"/>
+            <w:tcW w:type="dxa" w:w="2160"/>
           </w:tcPr>
           <w:p>
             <w:r>
               <w:rPr>
                 <w:rFonts w:ascii="Arial" w:hAnsi="Arial"/>
                 <w:b/>
+                <w:i w:val="0"/>
                 <w:color w:val="000000"/>
-                <w:sz w:val="18"/>
+                <w:sz w:val="22"/>
               </w:rPr>
               <w:t>OECD</w:t>
             </w:r>
@@ -512,16 +515,16 @@
         </w:tc>
         <w:tc>
           <w:tcPr>
-            <w:tcW w:type="dxa" w:w="3685"/>
-            <w:vAlign w:val="top"/>
+            <w:tcW w:type="dxa" w:w="2160"/>
           </w:tcPr>
           <w:p>
             <w:r>
               <w:rPr>
                 <w:rFonts w:ascii="Arial" w:hAnsi="Arial"/>
                 <w:b w:val="0"/>
+                <w:i w:val="0"/>
                 <w:color w:val="000000"/>
-                <w:sz w:val="18"/>
+                <w:sz w:val="22"/>
               </w:rPr>
               <w:t>Organisation for Economic Cooperation and Development</w:t>
             </w:r>
@@ -531,16 +534,16 @@
       <w:tr>
         <w:tc>
           <w:tcPr>
-            <w:tcW w:type="dxa" w:w="1247"/>
-            <w:vAlign w:val="top"/>
+            <w:tcW w:type="dxa" w:w="2160"/>
           </w:tcPr>
           <w:p>
             <w:r>
               <w:rPr>
                 <w:rFonts w:ascii="Arial" w:hAnsi="Arial"/>
                 <w:b/>
+                <w:i w:val="0"/>
                 <w:color w:val="000000"/>
-                <w:sz w:val="18"/>
+                <w:sz w:val="22"/>
               </w:rPr>
               <w:t>EC</w:t>
             </w:r>
@@ -548,16 +551,16 @@
         </w:tc>
         <w:tc>
           <w:tcPr>
-            <w:tcW w:type="dxa" w:w="3685"/>
-            <w:vAlign w:val="top"/>
+            <w:tcW w:type="dxa" w:w="2160"/>
           </w:tcPr>
           <w:p>
             <w:r>
               <w:rPr>
                 <w:rFonts w:ascii="Arial" w:hAnsi="Arial"/>
                 <w:b w:val="0"/>
+                <w:i w:val="0"/>
                 <w:color w:val="000000"/>
-                <w:sz w:val="18"/>
+                <w:sz w:val="22"/>
               </w:rPr>
               <w:t>European Commission</w:t>
             </w:r>
@@ -565,16 +568,16 @@
         </w:tc>
         <w:tc>
           <w:tcPr>
-            <w:tcW w:type="dxa" w:w="1247"/>
-            <w:vAlign w:val="top"/>
+            <w:tcW w:type="dxa" w:w="2160"/>
           </w:tcPr>
           <w:p>
             <w:r>
               <w:rPr>
                 <w:rFonts w:ascii="Arial" w:hAnsi="Arial"/>
                 <w:b/>
+                <w:i w:val="0"/>
                 <w:color w:val="000000"/>
-                <w:sz w:val="18"/>
+                <w:sz w:val="22"/>
               </w:rPr>
               <w:t>OER</w:t>
             </w:r>
@@ -582,16 +585,16 @@
         </w:tc>
         <w:tc>
           <w:tcPr>
-            <w:tcW w:type="dxa" w:w="3685"/>
-            <w:vAlign w:val="top"/>
+            <w:tcW w:type="dxa" w:w="2160"/>
           </w:tcPr>
           <w:p>
             <w:r>
               <w:rPr>
                 <w:rFonts w:ascii="Arial" w:hAnsi="Arial"/>
                 <w:b w:val="0"/>
+                <w:i w:val="0"/>
                 <w:color w:val="000000"/>
-                <w:sz w:val="18"/>
+                <w:sz w:val="22"/>
               </w:rPr>
               <w:t>Open Educational Resources</w:t>
             </w:r>
@@ -601,16 +604,16 @@
       <w:tr>
         <w:tc>
           <w:tcPr>
-            <w:tcW w:type="dxa" w:w="1247"/>
-            <w:vAlign w:val="top"/>
+            <w:tcW w:type="dxa" w:w="2160"/>
           </w:tcPr>
           <w:p>
             <w:r>
               <w:rPr>
                 <w:rFonts w:ascii="Arial" w:hAnsi="Arial"/>
                 <w:b/>
+                <w:i w:val="0"/>
                 <w:color w:val="000000"/>
-                <w:sz w:val="18"/>
+                <w:sz w:val="22"/>
               </w:rPr>
               <w:t>EMPL</w:t>
             </w:r>
@@ -618,16 +621,16 @@
         </w:tc>
         <w:tc>
           <w:tcPr>
-            <w:tcW w:type="dxa" w:w="3685"/>
-            <w:vAlign w:val="top"/>
+            <w:tcW w:type="dxa" w:w="2160"/>
           </w:tcPr>
           <w:p>
             <w:r>
               <w:rPr>
                 <w:rFonts w:ascii="Arial" w:hAnsi="Arial"/>
                 <w:b w:val="0"/>
+                <w:i w:val="0"/>
                 <w:color w:val="000000"/>
-                <w:sz w:val="18"/>
+                <w:sz w:val="22"/>
               </w:rPr>
               <w:t>Directorate-General for Employment, Social Affairs and Inclusion</w:t>
             </w:r>
@@ -635,16 +638,16 @@
         </w:tc>
         <w:tc>
           <w:tcPr>
-            <w:tcW w:type="dxa" w:w="1247"/>
-            <w:vAlign w:val="top"/>
+            <w:tcW w:type="dxa" w:w="2160"/>
           </w:tcPr>
           <w:p>
             <w:r>
               <w:rPr>
                 <w:rFonts w:ascii="Arial" w:hAnsi="Arial"/>
                 <w:b/>
+                <w:i w:val="0"/>
                 <w:color w:val="000000"/>
-                <w:sz w:val="18"/>
+                <w:sz w:val="22"/>
               </w:rPr>
               <w:t>REFORM</w:t>
             </w:r>
@@ -652,16 +655,16 @@
         </w:tc>
         <w:tc>
           <w:tcPr>
-            <w:tcW w:type="dxa" w:w="3685"/>
-            <w:vAlign w:val="top"/>
+            <w:tcW w:type="dxa" w:w="2160"/>
           </w:tcPr>
           <w:p>
             <w:r>
               <w:rPr>
                 <w:rFonts w:ascii="Arial" w:hAnsi="Arial"/>
                 <w:b w:val="0"/>
+                <w:i w:val="0"/>
                 <w:color w:val="000000"/>
-                <w:sz w:val="18"/>
+                <w:sz w:val="22"/>
               </w:rPr>
               <w:t>Reform and Investment Task Force</w:t>
             </w:r>
@@ -671,16 +674,16 @@
       <w:tr>
         <w:tc>
           <w:tcPr>
-            <w:tcW w:type="dxa" w:w="1247"/>
-            <w:vAlign w:val="top"/>
+            <w:tcW w:type="dxa" w:w="2160"/>
           </w:tcPr>
           <w:p>
             <w:r>
               <w:rPr>
                 <w:rFonts w:ascii="Arial" w:hAnsi="Arial"/>
                 <w:b/>
+                <w:i w:val="0"/>
                 <w:color w:val="000000"/>
-                <w:sz w:val="18"/>
+                <w:sz w:val="22"/>
               </w:rPr>
               <w:t>EQF</w:t>
             </w:r>
@@ -688,16 +691,16 @@
         </w:tc>
         <w:tc>
           <w:tcPr>
-            <w:tcW w:type="dxa" w:w="3685"/>
-            <w:vAlign w:val="top"/>
+            <w:tcW w:type="dxa" w:w="2160"/>
           </w:tcPr>
           <w:p>
             <w:r>
               <w:rPr>
                 <w:rFonts w:ascii="Arial" w:hAnsi="Arial"/>
                 <w:b w:val="0"/>
+                <w:i w:val="0"/>
                 <w:color w:val="000000"/>
-                <w:sz w:val="18"/>
+                <w:sz w:val="22"/>
               </w:rPr>
               <w:t>European Qualifications Framework</w:t>
             </w:r>
@@ -705,16 +708,16 @@
         </w:tc>
         <w:tc>
           <w:tcPr>
-            <w:tcW w:type="dxa" w:w="1247"/>
-            <w:vAlign w:val="top"/>
+            <w:tcW w:type="dxa" w:w="2160"/>
           </w:tcPr>
           <w:p>
             <w:r>
               <w:rPr>
                 <w:rFonts w:ascii="Arial" w:hAnsi="Arial"/>
                 <w:b/>
+                <w:i w:val="0"/>
                 <w:color w:val="000000"/>
-                <w:sz w:val="18"/>
+                <w:sz w:val="22"/>
               </w:rPr>
               <w:t>SJ</w:t>
             </w:r>
@@ -722,16 +725,16 @@
         </w:tc>
         <w:tc>
           <w:tcPr>
-            <w:tcW w:type="dxa" w:w="3685"/>
-            <w:vAlign w:val="top"/>
+            <w:tcW w:type="dxa" w:w="2160"/>
           </w:tcPr>
           <w:p>
             <w:r>
               <w:rPr>
                 <w:rFonts w:ascii="Arial" w:hAnsi="Arial"/>
                 <w:b w:val="0"/>
+                <w:i w:val="0"/>
                 <w:color w:val="000000"/>
-                <w:sz w:val="18"/>
+                <w:sz w:val="22"/>
               </w:rPr>
               <w:t>Le Service juridique (Legal service of the European Commission)</w:t>
             </w:r>
@@ -741,16 +744,16 @@
       <w:tr>
         <w:tc>
           <w:tcPr>
-            <w:tcW w:type="dxa" w:w="1247"/>
-            <w:vAlign w:val="top"/>
+            <w:tcW w:type="dxa" w:w="2160"/>
           </w:tcPr>
           <w:p>
             <w:r>
               <w:rPr>
                 <w:rFonts w:ascii="Arial" w:hAnsi="Arial"/>
                 <w:b/>
+                <w:i w:val="0"/>
                 <w:color w:val="000000"/>
-                <w:sz w:val="18"/>
+                <w:sz w:val="22"/>
               </w:rPr>
               <w:t>ESTAT</w:t>
             </w:r>
@@ -758,16 +761,16 @@
         </w:tc>
         <w:tc>
           <w:tcPr>
-            <w:tcW w:type="dxa" w:w="3685"/>
-            <w:vAlign w:val="top"/>
+            <w:tcW w:type="dxa" w:w="2160"/>
           </w:tcPr>
           <w:p>
             <w:r>
               <w:rPr>
                 <w:rFonts w:ascii="Arial" w:hAnsi="Arial"/>
                 <w:b w:val="0"/>
+                <w:i w:val="0"/>
                 <w:color w:val="000000"/>
-                <w:sz w:val="18"/>
+                <w:sz w:val="22"/>
               </w:rPr>
               <w:t>Eurostat</w:t>
             </w:r>
@@ -775,16 +778,16 @@
         </w:tc>
         <w:tc>
           <w:tcPr>
-            <w:tcW w:type="dxa" w:w="1247"/>
-            <w:vAlign w:val="top"/>
+            <w:tcW w:type="dxa" w:w="2160"/>
           </w:tcPr>
           <w:p>
             <w:r>
               <w:rPr>
                 <w:rFonts w:ascii="Arial" w:hAnsi="Arial"/>
                 <w:b/>
+                <w:i w:val="0"/>
                 <w:color w:val="000000"/>
-                <w:sz w:val="18"/>
+                <w:sz w:val="22"/>
               </w:rPr>
               <w:t>STEM</w:t>
             </w:r>
@@ -792,16 +795,16 @@
         </w:tc>
         <w:tc>
           <w:tcPr>
-            <w:tcW w:type="dxa" w:w="3685"/>
-            <w:vAlign w:val="top"/>
+            <w:tcW w:type="dxa" w:w="2160"/>
           </w:tcPr>
           <w:p>
             <w:r>
               <w:rPr>
                 <w:rFonts w:ascii="Arial" w:hAnsi="Arial"/>
                 <w:b w:val="0"/>
+                <w:i w:val="0"/>
                 <w:color w:val="000000"/>
-                <w:sz w:val="18"/>
+                <w:sz w:val="22"/>
               </w:rPr>
               <w:t>Science, Technology, Engineering and Mathematics</w:t>
             </w:r>
@@ -811,16 +814,16 @@
       <w:tr>
         <w:tc>
           <w:tcPr>
-            <w:tcW w:type="dxa" w:w="1247"/>
-            <w:vAlign w:val="top"/>
+            <w:tcW w:type="dxa" w:w="2160"/>
           </w:tcPr>
           <w:p>
             <w:r>
               <w:rPr>
                 <w:rFonts w:ascii="Arial" w:hAnsi="Arial"/>
                 <w:b/>
+                <w:i w:val="0"/>
                 <w:color w:val="000000"/>
-                <w:sz w:val="18"/>
+                <w:sz w:val="22"/>
               </w:rPr>
               <w:t>EU</w:t>
             </w:r>
@@ -828,16 +831,16 @@
         </w:tc>
         <w:tc>
           <w:tcPr>
-            <w:tcW w:type="dxa" w:w="3685"/>
-            <w:vAlign w:val="top"/>
+            <w:tcW w:type="dxa" w:w="2160"/>
           </w:tcPr>
           <w:p>
             <w:r>
               <w:rPr>
                 <w:rFonts w:ascii="Arial" w:hAnsi="Arial"/>
                 <w:b w:val="0"/>
+                <w:i w:val="0"/>
                 <w:color w:val="000000"/>
-                <w:sz w:val="18"/>
+                <w:sz w:val="22"/>
               </w:rPr>
               <w:t>European Union</w:t>
             </w:r>
@@ -845,16 +848,16 @@
         </w:tc>
         <w:tc>
           <w:tcPr>
-            <w:tcW w:type="dxa" w:w="1247"/>
-            <w:vAlign w:val="top"/>
+            <w:tcW w:type="dxa" w:w="2160"/>
           </w:tcPr>
           <w:p>
             <w:r>
               <w:rPr>
                 <w:rFonts w:ascii="Arial" w:hAnsi="Arial"/>
                 <w:b/>
+                <w:i w:val="0"/>
                 <w:color w:val="000000"/>
-                <w:sz w:val="18"/>
+                <w:sz w:val="22"/>
               </w:rPr>
               <w:t>UN</w:t>
             </w:r>
@@ -862,16 +865,16 @@
         </w:tc>
         <w:tc>
           <w:tcPr>
-            <w:tcW w:type="dxa" w:w="3685"/>
-            <w:vAlign w:val="top"/>
+            <w:tcW w:type="dxa" w:w="2160"/>
           </w:tcPr>
           <w:p>
             <w:r>
               <w:rPr>
                 <w:rFonts w:ascii="Arial" w:hAnsi="Arial"/>
                 <w:b w:val="0"/>
+                <w:i w:val="0"/>
                 <w:color w:val="000000"/>
-                <w:sz w:val="18"/>
+                <w:sz w:val="22"/>
               </w:rPr>
               <w:t>United Nations</w:t>
             </w:r>
@@ -881,16 +884,16 @@
       <w:tr>
         <w:tc>
           <w:tcPr>
-            <w:tcW w:type="dxa" w:w="1247"/>
-            <w:vAlign w:val="top"/>
+            <w:tcW w:type="dxa" w:w="2160"/>
           </w:tcPr>
           <w:p>
             <w:r>
               <w:rPr>
                 <w:rFonts w:ascii="Arial" w:hAnsi="Arial"/>
                 <w:b/>
+                <w:i w:val="0"/>
                 <w:color w:val="000000"/>
-                <w:sz w:val="18"/>
+                <w:sz w:val="22"/>
               </w:rPr>
               <w:t>EUIPO</w:t>
             </w:r>
@@ -898,16 +901,16 @@
         </w:tc>
         <w:tc>
           <w:tcPr>
-            <w:tcW w:type="dxa" w:w="3685"/>
-            <w:vAlign w:val="top"/>
+            <w:tcW w:type="dxa" w:w="2160"/>
           </w:tcPr>
           <w:p>
             <w:r>
               <w:rPr>
                 <w:rFonts w:ascii="Arial" w:hAnsi="Arial"/>
                 <w:b w:val="0"/>
+                <w:i w:val="0"/>
                 <w:color w:val="000000"/>
-                <w:sz w:val="18"/>
+                <w:sz w:val="22"/>
               </w:rPr>
               <w:t>European Union Intellectual Property Office</w:t>
             </w:r>
@@ -915,16 +918,16 @@
         </w:tc>
         <w:tc>
           <w:tcPr>
-            <w:tcW w:type="dxa" w:w="1247"/>
-            <w:vAlign w:val="top"/>
+            <w:tcW w:type="dxa" w:w="2160"/>
           </w:tcPr>
           <w:p>
             <w:r>
               <w:rPr>
                 <w:rFonts w:ascii="Arial" w:hAnsi="Arial"/>
                 <w:b/>
+                <w:i w:val="0"/>
                 <w:color w:val="000000"/>
-                <w:sz w:val="18"/>
+                <w:sz w:val="22"/>
               </w:rPr>
               <w:t>UNESCO</w:t>
             </w:r>
@@ -932,16 +935,16 @@
         </w:tc>
         <w:tc>
           <w:tcPr>
-            <w:tcW w:type="dxa" w:w="3685"/>
-            <w:vAlign w:val="top"/>
+            <w:tcW w:type="dxa" w:w="2160"/>
           </w:tcPr>
           <w:p>
             <w:r>
               <w:rPr>
                 <w:rFonts w:ascii="Arial" w:hAnsi="Arial"/>
                 <w:b w:val="0"/>
+                <w:i w:val="0"/>
                 <w:color w:val="000000"/>
-                <w:sz w:val="18"/>
+                <w:sz w:val="22"/>
               </w:rPr>
               <w:t>United Nations Educational, Scientific and Cultural Organisation</w:t>
             </w:r>
@@ -951,16 +954,16 @@
       <w:tr>
         <w:tc>
           <w:tcPr>
-            <w:tcW w:type="dxa" w:w="1247"/>
-            <w:vAlign w:val="top"/>
+            <w:tcW w:type="dxa" w:w="2160"/>
           </w:tcPr>
           <w:p>
             <w:r>
               <w:rPr>
                 <w:rFonts w:ascii="Arial" w:hAnsi="Arial"/>
                 <w:b/>
+                <w:i w:val="0"/>
                 <w:color w:val="000000"/>
-                <w:sz w:val="18"/>
+                <w:sz w:val="22"/>
               </w:rPr>
               <w:t>GDPR</w:t>
             </w:r>
@@ -968,16 +971,16 @@
         </w:tc>
         <w:tc>
           <w:tcPr>
-            <w:tcW w:type="dxa" w:w="3685"/>
-            <w:vAlign w:val="top"/>
+            <w:tcW w:type="dxa" w:w="2160"/>
           </w:tcPr>
           <w:p>
             <w:r>
               <w:rPr>
                 <w:rFonts w:ascii="Arial" w:hAnsi="Arial"/>
                 <w:b w:val="0"/>
+                <w:i w:val="0"/>
                 <w:color w:val="000000"/>
-                <w:sz w:val="18"/>
+                <w:sz w:val="22"/>
               </w:rPr>
               <w:t>General Data Protection Regulation</w:t>
             </w:r>
@@ -985,16 +988,16 @@
         </w:tc>
         <w:tc>
           <w:tcPr>
-            <w:tcW w:type="dxa" w:w="1247"/>
-            <w:vAlign w:val="top"/>
+            <w:tcW w:type="dxa" w:w="2160"/>
           </w:tcPr>
           <w:p>
             <w:r>
               <w:rPr>
                 <w:rFonts w:ascii="Arial" w:hAnsi="Arial"/>
                 <w:b/>
+                <w:i w:val="0"/>
                 <w:color w:val="000000"/>
-                <w:sz w:val="18"/>
+                <w:sz w:val="22"/>
               </w:rPr>
               <w:t>VET</w:t>
             </w:r>
@@ -1002,16 +1005,16 @@
         </w:tc>
         <w:tc>
           <w:tcPr>
-            <w:tcW w:type="dxa" w:w="3685"/>
-            <w:vAlign w:val="top"/>
+            <w:tcW w:type="dxa" w:w="2160"/>
           </w:tcPr>
           <w:p>
             <w:r>
               <w:rPr>
                 <w:rFonts w:ascii="Arial" w:hAnsi="Arial"/>
                 <w:b w:val="0"/>
+                <w:i w:val="0"/>
                 <w:color w:val="000000"/>
-                <w:sz w:val="18"/>
+                <w:sz w:val="22"/>
               </w:rPr>
               <w:t>Vocational Education and Training</w:t>
             </w:r>
@@ -1021,16 +1024,16 @@
       <w:tr>
         <w:tc>
           <w:tcPr>
-            <w:tcW w:type="dxa" w:w="1247"/>
-            <w:vAlign w:val="top"/>
+            <w:tcW w:type="dxa" w:w="2160"/>
           </w:tcPr>
           <w:p>
             <w:r>
               <w:rPr>
                 <w:rFonts w:ascii="Arial" w:hAnsi="Arial"/>
                 <w:b/>
+                <w:i w:val="0"/>
                 <w:color w:val="000000"/>
-                <w:sz w:val="18"/>
+                <w:sz w:val="22"/>
               </w:rPr>
               <w:t>ICILS</w:t>
             </w:r>
@@ -1038,16 +1041,16 @@
         </w:tc>
         <w:tc>
           <w:tcPr>
-            <w:tcW w:type="dxa" w:w="3685"/>
-            <w:vAlign w:val="top"/>
+            <w:tcW w:type="dxa" w:w="2160"/>
           </w:tcPr>
           <w:p>
             <w:r>
               <w:rPr>
                 <w:rFonts w:ascii="Arial" w:hAnsi="Arial"/>
                 <w:b w:val="0"/>
+                <w:i w:val="0"/>
                 <w:color w:val="000000"/>
-                <w:sz w:val="18"/>
+                <w:sz w:val="22"/>
               </w:rPr>
               <w:t>International Computer and Information Literacy Study</w:t>
             </w:r>
@@ -1055,16 +1058,16 @@
         </w:tc>
         <w:tc>
           <w:tcPr>
-            <w:tcW w:type="dxa" w:w="1247"/>
-            <w:vAlign w:val="top"/>
+            <w:tcW w:type="dxa" w:w="2160"/>
           </w:tcPr>
           <w:p>
             <w:r>
               <w:rPr>
                 <w:rFonts w:ascii="Arial" w:hAnsi="Arial"/>
                 <w:b/>
+                <w:i w:val="0"/>
                 <w:color w:val="000000"/>
-                <w:sz w:val="18"/>
+                <w:sz w:val="22"/>
               </w:rPr>
               <w:t>VR</w:t>
             </w:r>
@@ -1072,16 +1075,16 @@
         </w:tc>
         <w:tc>
           <w:tcPr>
-            <w:tcW w:type="dxa" w:w="3685"/>
-            <w:vAlign w:val="top"/>
+            <w:tcW w:type="dxa" w:w="2160"/>
           </w:tcPr>
           <w:p>
             <w:r>
               <w:rPr>
                 <w:rFonts w:ascii="Arial" w:hAnsi="Arial"/>
                 <w:b w:val="0"/>
+                <w:i w:val="0"/>
                 <w:color w:val="000000"/>
-                <w:sz w:val="18"/>
+                <w:sz w:val="22"/>
               </w:rPr>
               <w:t>Virtual Reality</w:t>
             </w:r>
@@ -1091,16 +1094,16 @@
       <w:tr>
         <w:tc>
           <w:tcPr>
-            <w:tcW w:type="dxa" w:w="1247"/>
-            <w:vAlign w:val="top"/>
+            <w:tcW w:type="dxa" w:w="2160"/>
           </w:tcPr>
           <w:p>
             <w:r>
               <w:rPr>
                 <w:rFonts w:ascii="Arial" w:hAnsi="Arial"/>
                 <w:b/>
+                <w:i w:val="0"/>
                 <w:color w:val="000000"/>
-                <w:sz w:val="18"/>
+                <w:sz w:val="22"/>
               </w:rPr>
               <w:t>ICT</w:t>
             </w:r>
@@ -1108,16 +1111,16 @@
         </w:tc>
         <w:tc>
           <w:tcPr>
-            <w:tcW w:type="dxa" w:w="3685"/>
-            <w:vAlign w:val="top"/>
+            <w:tcW w:type="dxa" w:w="2160"/>
           </w:tcPr>
           <w:p>
             <w:r>
               <w:rPr>
                 <w:rFonts w:ascii="Arial" w:hAnsi="Arial"/>
                 <w:b w:val="0"/>
+                <w:i w:val="0"/>
                 <w:color w:val="000000"/>
-                <w:sz w:val="18"/>
+                <w:sz w:val="22"/>
               </w:rPr>
               <w:t>Information and Communications Technologies</w:t>
             </w:r>
@@ -1125,16 +1128,16 @@
         </w:tc>
         <w:tc>
           <w:tcPr>
-            <w:tcW w:type="dxa" w:w="1247"/>
-            <w:vAlign w:val="top"/>
+            <w:tcW w:type="dxa" w:w="2160"/>
           </w:tcPr>
           <w:p>
             <w:r>
               <w:rPr>
                 <w:rFonts w:ascii="Arial" w:hAnsi="Arial"/>
                 <w:b/>
+                <w:i w:val="0"/>
                 <w:color w:val="000000"/>
-                <w:sz w:val="18"/>
+                <w:sz w:val="22"/>
               </w:rPr>
               <w:t>XR</w:t>
             </w:r>
@@ -1142,16 +1145,16 @@
         </w:tc>
         <w:tc>
           <w:tcPr>
-            <w:tcW w:type="dxa" w:w="3685"/>
-            <w:vAlign w:val="top"/>
+            <w:tcW w:type="dxa" w:w="2160"/>
           </w:tcPr>
           <w:p>
             <w:r>
               <w:rPr>
                 <w:rFonts w:ascii="Arial" w:hAnsi="Arial"/>
                 <w:b w:val="0"/>
+                <w:i w:val="0"/>
                 <w:color w:val="000000"/>
-                <w:sz w:val="18"/>
+                <w:sz w:val="22"/>
               </w:rPr>
               <w:t>eXtended Reality</w:t>
             </w:r>

</xml_diff>